<commit_message>
Australia: apply final audit fixes, rebuild documents and package
Third verifier (strongest model) audited the resolved files: no high-severity
flags; wording, source and evidence-date fixes applied.

Co-Authored-By: Claude Opus 5.5 <noreply@anthropic.com>
Claude-Session: https://claude.ai/code/session_01ChEN58PbdXFZmwUoBZYBRb
</commit_message>
<xml_diff>
--- a/output/Australia_Profile_DRAFT.docx
+++ b/output/Australia_Profile_DRAFT.docx
@@ -1617,7 +1617,7 @@
         <w:widowControl/>
       </w:pPr>
       <w:r>
-        <w:t>Health responsibilities are split. The Commonwealth funds Medicare and the Pharmaceutical Benefits Scheme, while the states own and manage the public hospitals.</w:t>
+        <w:t>Health responsibilities are split. The Commonwealth funds Medicare and the Pharmaceutical Benefits Scheme, while the states manage the public hospitals.</w:t>
       </w:r>
       <w:hyperlink r:id="rId28">
         <w:r>
@@ -2447,7 +2447,36 @@
         <w:widowControl/>
       </w:pPr>
       <w:r>
-        <w:t>Australia's public system rests on Medicare, a universal insurance program financed from general tax revenue and a levy, which covers the full cost of public hospital services for citizens, permanent residents and visitors from reciprocal-agreement countries and gives substantial coverage for physician services and pharmaceuticals.</w:t>
+        <w:t>Australia's public system rests on Medicare, a universal insurance program financed from general tax revenue and a levy, which covers citizens, permanent residents and people from reciprocal-agreement countries, pays the full cost of public hospital services and part of the cost of other services, and subsidizes most medicines through the Pharmaceutical Benefits Scheme.</w:t>
+      </w:r>
+      <w:hyperlink r:id="rId28">
+        <w:r>
+          <w:rPr>
+            <w:color w:val="B31822"/>
+            <w:vertAlign w:val="superscript"/>
+          </w:rPr>
+          <w:t xml:space="preserve">18</w:t>
+        </w:r>
+      </w:hyperlink>
+      <w:r>
+        <w:t xml:space="preserve"> The Commonwealth funds care through the Medicare Benefits Schedule and the Pharmaceutical Benefits Scheme, and the states own and manage the public hospitals.</w:t>
+      </w:r>
+      <w:hyperlink r:id="rId28">
+        <w:r>
+          <w:rPr>
+            <w:color w:val="B31822"/>
+            <w:vertAlign w:val="superscript"/>
+          </w:rPr>
+          <w:t xml:space="preserve">18</w:t>
+        </w:r>
+      </w:hyperlink>
+    </w:p>
+    <w:p>
+      <w:pPr>
+        <w:widowControl/>
+      </w:pPr>
+      <w:r>
+        <w:t>In 2023-24 there were 704 public hospitals with 67,280 available beds, or 2.5 per 1,000 people, and total recurrent spending of A$103.1 billion, 94 percent of it funded by governments.</w:t>
       </w:r>
       <w:hyperlink r:id="rId33">
         <w:r>
@@ -2459,7 +2488,7 @@
         </w:r>
       </w:hyperlink>
       <w:r>
-        <w:t xml:space="preserve"> The Commonwealth funds care through the Medicare Benefits Schedule and the Pharmaceutical Benefits Scheme, and the states own and manage the public hospitals.</w:t>
+        <w:t xml:space="preserve"> Public hospitals recorded about 7.5 million separations that year and 9,094,312 emergency department presentations in 2024-25.</w:t>
       </w:r>
       <w:hyperlink r:id="rId33">
         <w:r>
@@ -2468,35 +2497,6 @@
             <w:vertAlign w:val="superscript"/>
           </w:rPr>
           <w:t xml:space="preserve">23</w:t>
-        </w:r>
-      </w:hyperlink>
-    </w:p>
-    <w:p>
-      <w:pPr>
-        <w:widowControl/>
-      </w:pPr>
-      <w:r>
-        <w:t>In 2023-24 there were 704 public hospitals with 67,280 available beds, or 2.5 per 1,000 people, and total recurrent spending of A$103.1 billion, 94 percent of it funded by governments.</w:t>
-      </w:r>
-      <w:hyperlink r:id="rId34">
-        <w:r>
-          <w:rPr>
-            <w:color w:val="B31822"/>
-            <w:vertAlign w:val="superscript"/>
-          </w:rPr>
-          <w:t xml:space="preserve">24</w:t>
-        </w:r>
-      </w:hyperlink>
-      <w:r>
-        <w:t xml:space="preserve"> Public hospitals recorded about 7.5 million separations that year and 9,094,312 emergency department presentations in 2024-25.</w:t>
-      </w:r>
-      <w:hyperlink r:id="rId34">
-        <w:r>
-          <w:rPr>
-            <w:color w:val="B31822"/>
-            <w:vertAlign w:val="superscript"/>
-          </w:rPr>
-          <w:t xml:space="preserve">24</w:t>
         </w:r>
       </w:hyperlink>
     </w:p>
@@ -2519,34 +2519,34 @@
       <w:r>
         <w:t xml:space="preserve"> The 2026-27 Budget provides A$220.3 billion over five years to the states and territories for public hospital services and the 2026-2031 addendum.</w:t>
       </w:r>
+      <w:hyperlink r:id="rId34">
+        <w:r>
+          <w:rPr>
+            <w:color w:val="B31822"/>
+            <w:vertAlign w:val="superscript"/>
+          </w:rPr>
+          <w:t xml:space="preserve">24</w:t>
+        </w:r>
+      </w:hyperlink>
+      <w:r>
+        <w:t xml:space="preserve"> In primary care, bulk billing incentives were extended to all Australians from 1 November 2025, and the government projects that 9 in 10 GP visits will be bulk billed by 2030.</w:t>
+      </w:r>
       <w:hyperlink r:id="rId35">
         <w:r>
           <w:rPr>
             <w:color w:val="B31822"/>
             <w:vertAlign w:val="superscript"/>
           </w:rPr>
-          <w:t xml:space="preserve">25</w:t>
+          <w:t xml:space="preserve">25,</w:t>
         </w:r>
       </w:hyperlink>
-      <w:r>
-        <w:t xml:space="preserve"> In primary care, bulk billing incentives were extended to all Australians from 1 November 2025, and the government projects that 9 in 10 GP visits will be bulk billed by 2030.</w:t>
-      </w:r>
       <w:hyperlink r:id="rId36">
         <w:r>
           <w:rPr>
             <w:color w:val="B31822"/>
             <w:vertAlign w:val="superscript"/>
           </w:rPr>
-          <w:t xml:space="preserve">26,</w:t>
-        </w:r>
-      </w:hyperlink>
-      <w:hyperlink r:id="rId37">
-        <w:r>
-          <w:rPr>
-            <w:color w:val="B31822"/>
-            <w:vertAlign w:val="superscript"/>
-          </w:rPr>
-          <w:t xml:space="preserve">27</w:t>
+          <w:t xml:space="preserve">26</w:t>
         </w:r>
       </w:hyperlink>
     </w:p>
@@ -2569,25 +2569,25 @@
       <w:r>
         <w:t>About 12.8 million people, or 45.8 percent of the population, held private hospital cover at 30 June 2026, and 55.5 percent had general treatment cover.</w:t>
       </w:r>
-      <w:hyperlink r:id="rId38">
+      <w:hyperlink r:id="rId37">
         <w:r>
           <w:rPr>
             <w:color w:val="B31822"/>
             <w:vertAlign w:val="superscript"/>
           </w:rPr>
-          <w:t xml:space="preserve">28</w:t>
+          <w:t xml:space="preserve">27</w:t>
         </w:r>
       </w:hyperlink>
       <w:r>
         <w:t xml:space="preserve"> Insurers paid A$5.3 billion in hospital benefits in the June 2026 quarter.</w:t>
       </w:r>
-      <w:hyperlink r:id="rId38">
+      <w:hyperlink r:id="rId37">
         <w:r>
           <w:rPr>
             <w:color w:val="B31822"/>
             <w:vertAlign w:val="superscript"/>
           </w:rPr>
-          <w:t xml:space="preserve">28</w:t>
+          <w:t xml:space="preserve">27</w:t>
         </w:r>
       </w:hyperlink>
       <w:r>
@@ -2622,6 +2622,18 @@
       <w:r>
         <w:t>The sector's second-largest operator went into receivership in 2025. Healthscope entered receivership in May 2025 after its North American private equity owner, Brookfield, withdrew support, and on 14 September 2026 the receivers announced that 25 hospitals would be divided among Calvary Health Care (14 hospitals), Healthe Care, ACURIO Health and KnG Group.</w:t>
       </w:r>
+      <w:hyperlink r:id="rId38">
+        <w:r>
+          <w:rPr>
+            <w:color w:val="B31822"/>
+            <w:vertAlign w:val="superscript"/>
+          </w:rPr>
+          <w:t xml:space="preserve">28</w:t>
+        </w:r>
+      </w:hyperlink>
+      <w:r>
+        <w:t xml:space="preserve"> Ramsay Health Care, listed on the Australian Securities Exchange since 1997, runs hospitals, clinics and services in Australia, Europe and the United Kingdom.</w:t>
+      </w:r>
       <w:hyperlink r:id="rId39">
         <w:r>
           <w:rPr>
@@ -2632,27 +2644,15 @@
         </w:r>
       </w:hyperlink>
       <w:r>
-        <w:t xml:space="preserve"> Ramsay Health Care, listed on the Australian Securities Exchange since 1997, runs hospitals, clinics and services in Australia, Europe and the United Kingdom.</w:t>
+        <w:t xml:space="preserve"> The 2026-27 Budget removes the age-based uplift of the private health insurance rebate from 1 April 2027, saving A$3.0 billion over four years.</w:t>
       </w:r>
-      <w:hyperlink r:id="rId40">
+      <w:hyperlink r:id="rId34">
         <w:r>
           <w:rPr>
             <w:color w:val="B31822"/>
             <w:vertAlign w:val="superscript"/>
           </w:rPr>
-          <w:t xml:space="preserve">30</w:t>
-        </w:r>
-      </w:hyperlink>
-      <w:r>
-        <w:t xml:space="preserve"> The 2026-27 Budget removes the age-based uplift of the private health insurance rebate from 1 April 2027, saving A$3.0 billion over four years.</w:t>
-      </w:r>
-      <w:hyperlink r:id="rId35">
-        <w:r>
-          <w:rPr>
-            <w:color w:val="B31822"/>
-            <w:vertAlign w:val="superscript"/>
-          </w:rPr>
-          <w:t xml:space="preserve">25</w:t>
+          <w:t xml:space="preserve">24</w:t>
         </w:r>
       </w:hyperlink>
     </w:p>
@@ -2719,13 +2719,13 @@
               </w:rPr>
               <w:t>A$290.7 billion, or A$10,614 per person</w:t>
             </w:r>
-            <w:hyperlink r:id="rId41">
+            <w:hyperlink r:id="rId40">
               <w:r>
                 <w:rPr>
                   <w:color w:val="B31822"/>
                   <w:vertAlign w:val="superscript"/>
                 </w:rPr>
-                <w:t xml:space="preserve">31</w:t>
+                <w:t xml:space="preserve">30</w:t>
               </w:r>
             </w:hyperlink>
           </w:p>
@@ -2764,13 +2764,13 @@
               </w:rPr>
               <w:t>10.40% (2023); 8.67% in 2012</w:t>
             </w:r>
-            <w:hyperlink r:id="rId42">
+            <w:hyperlink r:id="rId41">
               <w:r>
                 <w:rPr>
                   <w:color w:val="B31822"/>
                   <w:vertAlign w:val="superscript"/>
                 </w:rPr>
-                <w:t xml:space="preserve">32</w:t>
+                <w:t xml:space="preserve">31</w:t>
               </w:r>
             </w:hyperlink>
           </w:p>
@@ -2814,13 +2814,13 @@
               </w:rPr>
               <w:t>US$6,980 (2023, current US$)</w:t>
             </w:r>
-            <w:hyperlink r:id="rId43">
+            <w:hyperlink r:id="rId42">
               <w:r>
                 <w:rPr>
                   <w:color w:val="B31822"/>
                   <w:vertAlign w:val="superscript"/>
                 </w:rPr>
-                <w:t xml:space="preserve">33</w:t>
+                <w:t xml:space="preserve">32</w:t>
               </w:r>
             </w:hyperlink>
           </w:p>
@@ -2859,13 +2859,13 @@
               </w:rPr>
               <w:t>15.8% (2023); 19.9% in 2012</w:t>
             </w:r>
-            <w:hyperlink r:id="rId44">
+            <w:hyperlink r:id="rId43">
               <w:r>
                 <w:rPr>
                   <w:color w:val="B31822"/>
                   <w:vertAlign w:val="superscript"/>
                 </w:rPr>
-                <w:t xml:space="preserve">34</w:t>
+                <w:t xml:space="preserve">33</w:t>
               </w:r>
             </w:hyperlink>
           </w:p>
@@ -2909,13 +2909,13 @@
               </w:rPr>
               <w:t>A$44 billion, or A$1,634 per person</w:t>
             </w:r>
-            <w:hyperlink r:id="rId45">
+            <w:hyperlink r:id="rId44">
               <w:r>
                 <w:rPr>
                   <w:color w:val="B31822"/>
                   <w:vertAlign w:val="superscript"/>
                 </w:rPr>
-                <w:t xml:space="preserve">35</w:t>
+                <w:t xml:space="preserve">34</w:t>
               </w:r>
             </w:hyperlink>
           </w:p>
@@ -2954,13 +2954,13 @@
               </w:rPr>
               <w:t>Hospital care 42% (A$123.4 billion); primary health care 32% (A$93.0 billion)</w:t>
             </w:r>
-            <w:hyperlink r:id="rId41">
+            <w:hyperlink r:id="rId40">
               <w:r>
                 <w:rPr>
                   <w:color w:val="B31822"/>
                   <w:vertAlign w:val="superscript"/>
                 </w:rPr>
-                <w:t xml:space="preserve">31</w:t>
+                <w:t xml:space="preserve">30</w:t>
               </w:r>
             </w:hyperlink>
           </w:p>
@@ -3004,13 +3004,13 @@
               </w:rPr>
               <w:t>New Zealand 10.13%, United Kingdom 10.99%, Canada 11.19%, OECD members 12.75%, United States 16.69%, Singapore 4.49%</w:t>
             </w:r>
-            <w:hyperlink r:id="rId46">
+            <w:hyperlink r:id="rId45">
               <w:r>
                 <w:rPr>
                   <w:color w:val="B31822"/>
                   <w:vertAlign w:val="superscript"/>
                 </w:rPr>
-                <w:t xml:space="preserve">36</w:t>
+                <w:t xml:space="preserve">35</w:t>
               </w:r>
             </w:hyperlink>
           </w:p>
@@ -3135,17 +3135,41 @@
       <w:r>
         <w:t>Total health spending reached A$290.7 billion in 2024-25, or A$10,614 per person, and governments funded 70 percent of it.</w:t>
       </w:r>
-      <w:hyperlink r:id="rId41">
+      <w:hyperlink r:id="rId40">
         <w:r>
           <w:rPr>
             <w:color w:val="B31822"/>
             <w:vertAlign w:val="superscript"/>
           </w:rPr>
-          <w:t xml:space="preserve">31</w:t>
+          <w:t xml:space="preserve">30</w:t>
         </w:r>
       </w:hyperlink>
       <w:r>
         <w:t xml:space="preserve"> Hospitals took A$123.4 billion, about 42 percent of the total, and primary health care A$93.0 billion, about 32 percent.</w:t>
+      </w:r>
+      <w:hyperlink r:id="rId40">
+        <w:r>
+          <w:rPr>
+            <w:color w:val="B31822"/>
+            <w:vertAlign w:val="superscript"/>
+          </w:rPr>
+          <w:t xml:space="preserve">30</w:t>
+        </w:r>
+      </w:hyperlink>
+      <w:r>
+        <w:t xml:space="preserve"> Spending rose by A$9.6 billion, or 3.4 percent, in real terms from 2023-24.</w:t>
+      </w:r>
+      <w:hyperlink r:id="rId40">
+        <w:r>
+          <w:rPr>
+            <w:color w:val="B31822"/>
+            <w:vertAlign w:val="superscript"/>
+          </w:rPr>
+          <w:t xml:space="preserve">30</w:t>
+        </w:r>
+      </w:hyperlink>
+      <w:r>
+        <w:t xml:space="preserve"> World Bank data put current health expenditure at 10.4 percent of GDP in 2023, up from 8.7 percent in 2012, while out-of-pocket spending fell from 19.9 percent to 15.8 percent of the total over the same period.</w:t>
       </w:r>
       <w:hyperlink r:id="rId41">
         <w:r>
@@ -3153,11 +3177,20 @@
             <w:color w:val="B31822"/>
             <w:vertAlign w:val="superscript"/>
           </w:rPr>
-          <w:t xml:space="preserve">31</w:t>
+          <w:t xml:space="preserve">31,</w:t>
+        </w:r>
+      </w:hyperlink>
+      <w:hyperlink r:id="rId43">
+        <w:r>
+          <w:rPr>
+            <w:color w:val="B31822"/>
+            <w:vertAlign w:val="superscript"/>
+          </w:rPr>
+          <w:t xml:space="preserve">33</w:t>
         </w:r>
       </w:hyperlink>
       <w:r>
-        <w:t xml:space="preserve"> Spending in 2023-24 had been A$270.5 billion.</w:t>
+        <w:t xml:space="preserve"> Among comparators, the share of GDP in 2023 was higher in Canada, the United Kingdom, the United States and the OECD average, and lower in New Zealand and Singapore.</w:t>
       </w:r>
       <w:hyperlink r:id="rId45">
         <w:r>
@@ -3169,17 +3202,8 @@
         </w:r>
       </w:hyperlink>
       <w:r>
-        <w:t xml:space="preserve"> World Bank data put current health expenditure at 10.4 percent of GDP in 2023, up from 8.7 percent in 2012, while out-of-pocket spending fell from 19.9 percent to 15.8 percent of the total over the same period.</w:t>
+        <w:t xml:space="preserve"> Households still paid A$44 billion out of pocket in 2023-24, the largest non-government contribution.</w:t>
       </w:r>
-      <w:hyperlink r:id="rId42">
-        <w:r>
-          <w:rPr>
-            <w:color w:val="B31822"/>
-            <w:vertAlign w:val="superscript"/>
-          </w:rPr>
-          <w:t xml:space="preserve">32,</w:t>
-        </w:r>
-      </w:hyperlink>
       <w:hyperlink r:id="rId44">
         <w:r>
           <w:rPr>
@@ -3187,30 +3211,6 @@
             <w:vertAlign w:val="superscript"/>
           </w:rPr>
           <w:t xml:space="preserve">34</w:t>
-        </w:r>
-      </w:hyperlink>
-      <w:r>
-        <w:t xml:space="preserve"> Among comparators, the share of GDP in 2023 was higher in Canada, the United Kingdom, the United States and the OECD average, and lower in New Zealand and Singapore.</w:t>
-      </w:r>
-      <w:hyperlink r:id="rId46">
-        <w:r>
-          <w:rPr>
-            <w:color w:val="B31822"/>
-            <w:vertAlign w:val="superscript"/>
-          </w:rPr>
-          <w:t xml:space="preserve">36</w:t>
-        </w:r>
-      </w:hyperlink>
-      <w:r>
-        <w:t xml:space="preserve"> Households still paid A$44 billion out of pocket in 2023-24, the largest non-government contribution.</w:t>
-      </w:r>
-      <w:hyperlink r:id="rId45">
-        <w:r>
-          <w:rPr>
-            <w:color w:val="B31822"/>
-            <w:vertAlign w:val="superscript"/>
-          </w:rPr>
-          <w:t xml:space="preserve">35</w:t>
         </w:r>
       </w:hyperlink>
     </w:p>
@@ -3294,13 +3294,13 @@
               </w:rPr>
               <w:t>4.09 (2022); 3.29 in 2012</w:t>
             </w:r>
-            <w:hyperlink r:id="rId47">
+            <w:hyperlink r:id="rId46">
               <w:r>
                 <w:rPr>
                   <w:color w:val="B31822"/>
                   <w:vertAlign w:val="superscript"/>
                 </w:rPr>
-                <w:t xml:space="preserve">37</w:t>
+                <w:t xml:space="preserve">36</w:t>
               </w:r>
             </w:hyperlink>
           </w:p>
@@ -3339,13 +3339,13 @@
               </w:rPr>
               <w:t>13.45 (2022)</w:t>
             </w:r>
-            <w:hyperlink r:id="rId48">
+            <w:hyperlink r:id="rId47">
               <w:r>
                 <w:rPr>
                   <w:color w:val="B31822"/>
                   <w:vertAlign w:val="superscript"/>
                 </w:rPr>
-                <w:t xml:space="preserve">38</w:t>
+                <w:t xml:space="preserve">37</w:t>
               </w:r>
             </w:hyperlink>
           </w:p>
@@ -3389,13 +3389,13 @@
               </w:rPr>
               <w:t>3.82 (2016, latest World Bank year)</w:t>
             </w:r>
-            <w:hyperlink r:id="rId49">
+            <w:hyperlink r:id="rId48">
               <w:r>
                 <w:rPr>
                   <w:color w:val="B31822"/>
                   <w:vertAlign w:val="superscript"/>
                 </w:rPr>
-                <w:t xml:space="preserve">39</w:t>
+                <w:t xml:space="preserve">38</w:t>
               </w:r>
             </w:hyperlink>
           </w:p>
@@ -3434,13 +3434,13 @@
               </w:rPr>
               <w:t>2.5 (2023-24)</w:t>
             </w:r>
-            <w:hyperlink r:id="rId34">
+            <w:hyperlink r:id="rId33">
               <w:r>
                 <w:rPr>
                   <w:color w:val="B31822"/>
                   <w:vertAlign w:val="superscript"/>
                 </w:rPr>
-                <w:t xml:space="preserve">24</w:t>
+                <w:t xml:space="preserve">23</w:t>
               </w:r>
             </w:hyperlink>
           </w:p>
@@ -3484,13 +3484,13 @@
               </w:rPr>
               <w:t>148,185 (2024-25), up 3.9% on 2023-24</w:t>
             </w:r>
-            <w:hyperlink r:id="rId50">
+            <w:hyperlink r:id="rId49">
               <w:r>
                 <w:rPr>
                   <w:color w:val="B31822"/>
                   <w:vertAlign w:val="superscript"/>
                 </w:rPr>
-                <w:t xml:space="preserve">40</w:t>
+                <w:t xml:space="preserve">39</w:t>
               </w:r>
             </w:hyperlink>
           </w:p>
@@ -3529,13 +3529,13 @@
               </w:rPr>
               <w:t>9,072 (2024-25), of whom 4,947 international</w:t>
             </w:r>
-            <w:hyperlink r:id="rId50">
+            <w:hyperlink r:id="rId49">
               <w:r>
                 <w:rPr>
                   <w:color w:val="B31822"/>
                   <w:vertAlign w:val="superscript"/>
                 </w:rPr>
-                <w:t xml:space="preserve">40</w:t>
+                <w:t xml:space="preserve">39</w:t>
               </w:r>
             </w:hyperlink>
           </w:p>
@@ -3577,13 +3577,13 @@
               </w:rPr>
               <w:t>178 registered by the end of June 2025, including 171 GPs</w:t>
             </w:r>
-            <w:hyperlink r:id="rId50">
+            <w:hyperlink r:id="rId49">
               <w:r>
                 <w:rPr>
                   <w:color w:val="B31822"/>
                   <w:vertAlign w:val="superscript"/>
                 </w:rPr>
-                <w:t xml:space="preserve">40</w:t>
+                <w:t xml:space="preserve">39</w:t>
               </w:r>
             </w:hyperlink>
           </w:p>
@@ -3615,39 +3615,48 @@
       <w:r>
         <w:t>Physician density rose from 3.29 per 1,000 people in 2012 to 4.09 in 2022, and nurses and midwives numbered 13.45 per 1,000 in 2022.</w:t>
       </w:r>
+      <w:hyperlink r:id="rId46">
+        <w:r>
+          <w:rPr>
+            <w:color w:val="B31822"/>
+            <w:vertAlign w:val="superscript"/>
+          </w:rPr>
+          <w:t xml:space="preserve">36,</w:t>
+        </w:r>
+      </w:hyperlink>
       <w:hyperlink r:id="rId47">
         <w:r>
           <w:rPr>
             <w:color w:val="B31822"/>
             <w:vertAlign w:val="superscript"/>
           </w:rPr>
-          <w:t xml:space="preserve">37,</w:t>
+          <w:t xml:space="preserve">37</w:t>
         </w:r>
       </w:hyperlink>
-      <w:hyperlink r:id="rId48">
+      <w:r>
+        <w:t xml:space="preserve"> The medical register held 148,185 practitioners in 2024-25, and 4,947 of the 9,072 first-time registrants were internationally qualified.</w:t>
+      </w:r>
+      <w:hyperlink r:id="rId49">
         <w:r>
           <w:rPr>
             <w:color w:val="B31822"/>
             <w:vertAlign w:val="superscript"/>
           </w:rPr>
-          <w:t xml:space="preserve">38</w:t>
+          <w:t xml:space="preserve">39</w:t>
         </w:r>
       </w:hyperlink>
       <w:r>
-        <w:t xml:space="preserve"> The medical register held 148,185 practitioners in 2024-25, and 4,947 of the 9,072 first-time registrants were internationally qualified.</w:t>
+        <w:t xml:space="preserve"> An expedited pathway for specialists from the United Kingdom, New Zealand and Ireland opened in October 2024, and 178 applicants had been registered by the end of June 2025, 171 of them GPs.</w:t>
       </w:r>
-      <w:hyperlink r:id="rId50">
+      <w:hyperlink r:id="rId49">
         <w:r>
           <w:rPr>
             <w:color w:val="B31822"/>
             <w:vertAlign w:val="superscript"/>
           </w:rPr>
-          <w:t xml:space="preserve">40</w:t>
+          <w:t xml:space="preserve">39,</w:t>
         </w:r>
       </w:hyperlink>
-      <w:r>
-        <w:t xml:space="preserve"> An expedited pathway for specialists from the United Kingdom, New Zealand and Ireland opened in October 2024, and 178 applicants had been registered by the end of June 2025, 171 of them GPs.</w:t>
-      </w:r>
       <w:hyperlink r:id="rId50">
         <w:r>
           <w:rPr>
@@ -3660,25 +3669,25 @@
       <w:r>
         <w:t xml:space="preserve"> In the first six months, to April 2025, 86 percent of applications came from the United Kingdom.</w:t>
       </w:r>
-      <w:hyperlink r:id="rId51">
+      <w:hyperlink r:id="rId50">
         <w:r>
           <w:rPr>
             <w:color w:val="B31822"/>
             <w:vertAlign w:val="superscript"/>
           </w:rPr>
-          <w:t xml:space="preserve">41</w:t>
+          <w:t xml:space="preserve">40</w:t>
         </w:r>
       </w:hyperlink>
       <w:r>
         <w:t xml:space="preserve"> Distribution is uneven: four in five of the specialists registered in the first six months of the pathway work in major cities, according to Medical Republic.</w:t>
       </w:r>
-      <w:hyperlink r:id="rId51">
+      <w:hyperlink r:id="rId50">
         <w:r>
           <w:rPr>
             <w:color w:val="B31822"/>
             <w:vertAlign w:val="superscript"/>
           </w:rPr>
-          <w:t xml:space="preserve">41</w:t>
+          <w:t xml:space="preserve">40</w:t>
         </w:r>
       </w:hyperlink>
     </w:p>
@@ -3699,15 +3708,15 @@
         <w:widowControl/>
       </w:pPr>
       <w:r>
-        <w:t>Medical education runs through public and private universities, followed by an accredited internship and residency.</w:t>
+        <w:t>Medical education runs through public and private universities: students complete an Australian Medical Council-accredited degree, followed by an internship and residency.</w:t>
       </w:r>
-      <w:hyperlink r:id="rId33">
+      <w:hyperlink r:id="rId28">
         <w:r>
           <w:rPr>
             <w:color w:val="B31822"/>
             <w:vertAlign w:val="superscript"/>
           </w:rPr>
-          <w:t xml:space="preserve">23</w:t>
+          <w:t xml:space="preserve">18</w:t>
         </w:r>
       </w:hyperlink>
       <w:r>
@@ -3730,6 +3739,18 @@
       <w:r>
         <w:t>After graduation, doctors train through the specialist colleges. The Commonwealth-funded Australian General Practice Training Program, for example, offers 3 to 4 years of full-time training.</w:t>
       </w:r>
+      <w:hyperlink r:id="rId51">
+        <w:r>
+          <w:rPr>
+            <w:color w:val="B31822"/>
+            <w:vertAlign w:val="superscript"/>
+          </w:rPr>
+          <w:t xml:space="preserve">41</w:t>
+        </w:r>
+      </w:hyperlink>
+      <w:r>
+        <w:t xml:space="preserve"> The 2024 Medical Training Survey had 24,812 respondents, more than half of doctors in training, and 62 percent of trainees said the financial cost of their college training program had led to stress.</w:t>
+      </w:r>
       <w:hyperlink r:id="rId52">
         <w:r>
           <w:rPr>
@@ -3739,8 +3760,13 @@
           <w:t xml:space="preserve">42</w:t>
         </w:r>
       </w:hyperlink>
+    </w:p>
+    <w:p>
+      <w:pPr>
+        <w:widowControl/>
+      </w:pPr>
       <w:r>
-        <w:t xml:space="preserve"> The 2024 Medical Training Survey had 24,812 respondents, more than half of doctors in training, and 62 percent of trainees said the financial cost of their college training program had led to stress.</w:t>
+        <w:t>Doctors who trained overseas generally follow a standard pathway: they pass the Australian Medical Council examinations to earn the AMC certificate, then hold provisional registration while completing approved supervised practice before general registration.</w:t>
       </w:r>
       <w:hyperlink r:id="rId53">
         <w:r>
@@ -3751,54 +3777,37 @@
           <w:t xml:space="preserve">43</w:t>
         </w:r>
       </w:hyperlink>
-    </w:p>
-    <w:p>
-      <w:pPr>
-        <w:widowControl/>
-      </w:pPr>
       <w:r>
-        <w:t>Doctors who trained overseas generally follow a standard pathway: they pass the Australian Medical Council examinations to earn the AMC certificate, then hold provisional registration while completing approved supervised practice before general registration.</w:t>
+        <w:t xml:space="preserve"> The Medical Board advises that Australian graduates have priority for accredited internship positions.</w:t>
       </w:r>
-      <w:hyperlink r:id="rId54">
+      <w:hyperlink r:id="rId53">
         <w:r>
           <w:rPr>
             <w:color w:val="B31822"/>
             <w:vertAlign w:val="superscript"/>
           </w:rPr>
-          <w:t xml:space="preserve">44</w:t>
+          <w:t xml:space="preserve">43</w:t>
         </w:r>
       </w:hyperlink>
       <w:r>
-        <w:t xml:space="preserve"> The Medical Board advises that Australian graduates have priority for accredited internship positions.</w:t>
+        <w:t xml:space="preserve"> Specialists with approved qualifications from the United Kingdom, New Zealand and Ireland can instead gain specialist registration through an expedited pathway without college assessment, and must then complete six months of supervised practice.</w:t>
       </w:r>
-      <w:hyperlink r:id="rId54">
+      <w:hyperlink r:id="rId49">
         <w:r>
           <w:rPr>
             <w:color w:val="B31822"/>
             <w:vertAlign w:val="superscript"/>
           </w:rPr>
-          <w:t xml:space="preserve">44</w:t>
+          <w:t xml:space="preserve">39,</w:t>
         </w:r>
       </w:hyperlink>
-      <w:r>
-        <w:t xml:space="preserve"> Specialists with approved qualifications from the United Kingdom, New Zealand and Ireland can instead register through an expedited pathway without college assessment, after six months of supervised practice.</w:t>
-      </w:r>
       <w:hyperlink r:id="rId50">
         <w:r>
           <w:rPr>
             <w:color w:val="B31822"/>
             <w:vertAlign w:val="superscript"/>
           </w:rPr>
-          <w:t xml:space="preserve">40,</w:t>
-        </w:r>
-      </w:hyperlink>
-      <w:hyperlink r:id="rId51">
-        <w:r>
-          <w:rPr>
-            <w:color w:val="B31822"/>
-            <w:vertAlign w:val="superscript"/>
-          </w:rPr>
-          <w:t xml:space="preserve">41</w:t>
+          <w:t xml:space="preserve">40</w:t>
         </w:r>
       </w:hyperlink>
     </w:p>
@@ -3854,6 +3863,18 @@
       <w:r>
         <w:t xml:space="preserve"> The 2026-27 Budget funds those clinics on an ongoing basis, at A$1.8 billion over five years, and redirects savings from the private health insurance rebate to aged care.</w:t>
       </w:r>
+      <w:hyperlink r:id="rId34">
+        <w:r>
+          <w:rPr>
+            <w:color w:val="B31822"/>
+            <w:vertAlign w:val="superscript"/>
+          </w:rPr>
+          <w:t xml:space="preserve">24</w:t>
+        </w:r>
+      </w:hyperlink>
+      <w:r>
+        <w:t xml:space="preserve"> The government projects that 9 in 10 GP visits will be bulk billed by 2030.</w:t>
+      </w:r>
       <w:hyperlink r:id="rId35">
         <w:r>
           <w:rPr>
@@ -3864,20 +3885,17 @@
         </w:r>
       </w:hyperlink>
       <w:r>
-        <w:t xml:space="preserve"> The government projects that 9 in 10 GP visits will be bulk billed by 2030.</w:t>
+        <w:t xml:space="preserve"> The Australian Centre for Disease Control, backed by A$251 million, became a statutory agency on 1 January 2026, with Professor Zoe Wainer as its first Director-General from March 2026.</w:t>
       </w:r>
-      <w:hyperlink r:id="rId36">
+      <w:hyperlink r:id="rId54">
         <w:r>
           <w:rPr>
             <w:color w:val="B31822"/>
             <w:vertAlign w:val="superscript"/>
           </w:rPr>
-          <w:t xml:space="preserve">26</w:t>
+          <w:t xml:space="preserve">44,</w:t>
         </w:r>
       </w:hyperlink>
-      <w:r>
-        <w:t xml:space="preserve"> The Australian Centre for Disease Control, backed by A$251 million, became a statutory agency on 1 January 2026, with Professor Zoe Wainer as its first Director-General from March 2026.</w:t>
-      </w:r>
       <w:hyperlink r:id="rId55">
         <w:r>
           <w:rPr>
@@ -3893,16 +3911,7 @@
             <w:color w:val="B31822"/>
             <w:vertAlign w:val="superscript"/>
           </w:rPr>
-          <w:t xml:space="preserve">46,</w:t>
-        </w:r>
-      </w:hyperlink>
-      <w:hyperlink r:id="rId57">
-        <w:r>
-          <w:rPr>
-            <w:color w:val="B31822"/>
-            <w:vertAlign w:val="superscript"/>
-          </w:rPr>
-          <w:t xml:space="preserve">47</w:t>
+          <w:t xml:space="preserve">46</w:t>
         </w:r>
       </w:hyperlink>
     </w:p>
@@ -3945,15 +3954,27 @@
       <w:r>
         <w:t>The visible foreign links to Australian health care are mostly research and training ties. Peter MacCallum Cancer Centre signed a second memorandum with Boston's Dana-Farber Cancer Institute in November 2022 and a partnership agreement with Britain's The Christie in April 2024.</w:t>
       </w:r>
+      <w:hyperlink r:id="rId57">
+        <w:r>
+          <w:rPr>
+            <w:color w:val="B31822"/>
+            <w:vertAlign w:val="superscript"/>
+          </w:rPr>
+          <w:t xml:space="preserve">47,</w:t>
+        </w:r>
+      </w:hyperlink>
       <w:hyperlink r:id="rId58">
         <w:r>
           <w:rPr>
             <w:color w:val="B31822"/>
             <w:vertAlign w:val="superscript"/>
           </w:rPr>
-          <w:t xml:space="preserve">48,</w:t>
+          <w:t xml:space="preserve">48</w:t>
         </w:r>
       </w:hyperlink>
+      <w:r>
+        <w:t xml:space="preserve"> Victoria announced Melbourne and Boston hospital partnerships in 2016.</w:t>
+      </w:r>
       <w:hyperlink r:id="rId59">
         <w:r>
           <w:rPr>
@@ -3964,27 +3985,15 @@
         </w:r>
       </w:hyperlink>
       <w:r>
-        <w:t xml:space="preserve"> Victoria announced Melbourne and Boston hospital partnerships in 2016.</w:t>
+        <w:t xml:space="preserve"> The partnerships tracker lists 18 active records, three of them members of a single children's genomics consortium with Murdoch Children's Research Institute and The Royal Children's Hospital. They include Ochsner Health and Emory University with the University of Queensland, Memorial Sloan Kettering with Northern Sydney Local Health District, Weill Cornell Medicine with Monash University and Cleveland Clinic with Epworth HealthCare. Among owners, Healthscope's North American private equity owner, Brookfield, withdrew support before its May 2025 receivership, and the receivers have since agreed to split its hospitals among four Australian operators.</w:t>
       </w:r>
-      <w:hyperlink r:id="rId60">
+      <w:hyperlink r:id="rId38">
         <w:r>
           <w:rPr>
             <w:color w:val="B31822"/>
             <w:vertAlign w:val="superscript"/>
           </w:rPr>
-          <w:t xml:space="preserve">50</w:t>
-        </w:r>
-      </w:hyperlink>
-      <w:r>
-        <w:t xml:space="preserve"> The partnerships tracker lists 18 active ties, including Ochsner Health and Emory University with the University of Queensland, Memorial Sloan Kettering with Northern Sydney Local Health District, Weill Cornell Medicine with Monash University and Cleveland Clinic with Epworth HealthCare. Among owners, Healthscope was owned by North American private equity firm Brookfield until its 2025 receivership.</w:t>
-      </w:r>
-      <w:hyperlink r:id="rId39">
-        <w:r>
-          <w:rPr>
-            <w:color w:val="B31822"/>
-            <w:vertAlign w:val="superscript"/>
-          </w:rPr>
-          <w:t xml:space="preserve">29</w:t>
+          <w:t xml:space="preserve">28</w:t>
         </w:r>
       </w:hyperlink>
     </w:p>
@@ -4010,7 +4019,7 @@
                     <pic:cNvPicPr/>
                   </pic:nvPicPr>
                   <pic:blipFill>
-                    <a:blip r:embed="rId61"/>
+                    <a:blip r:embed="rId60"/>
                     <a:stretch>
                       <a:fillRect/>
                     </a:stretch>
@@ -4225,13 +4234,13 @@
               </w:rPr>
               <w:t>2025-02</w:t>
             </w:r>
-            <w:hyperlink r:id="rId60">
+            <w:hyperlink r:id="rId59">
               <w:r>
                 <w:rPr>
                   <w:color w:val="B31822"/>
                   <w:vertAlign w:val="superscript"/>
                 </w:rPr>
-                <w:t xml:space="preserve">50</w:t>
+                <w:t xml:space="preserve">49</w:t>
               </w:r>
             </w:hyperlink>
           </w:p>
@@ -4293,15 +4302,15 @@
                 <w:b w:val="0"/>
                 <w:sz w:val="17"/>
               </w:rPr>
-              <w:t>2026-02</w:t>
+              <w:t>2025-11</w:t>
             </w:r>
-            <w:hyperlink r:id="rId62">
+            <w:hyperlink r:id="rId61">
               <w:r>
                 <w:rPr>
                   <w:color w:val="B31822"/>
                   <w:vertAlign w:val="superscript"/>
                 </w:rPr>
-                <w:t xml:space="preserve">51</w:t>
+                <w:t xml:space="preserve">50</w:t>
               </w:r>
             </w:hyperlink>
           </w:p>
@@ -4365,13 +4374,13 @@
               </w:rPr>
               <w:t>2025-01</w:t>
             </w:r>
-            <w:hyperlink r:id="rId63">
+            <w:hyperlink r:id="rId62">
               <w:r>
                 <w:rPr>
                   <w:color w:val="B31822"/>
                   <w:vertAlign w:val="superscript"/>
                 </w:rPr>
-                <w:t xml:space="preserve">52</w:t>
+                <w:t xml:space="preserve">51</w:t>
               </w:r>
             </w:hyperlink>
           </w:p>
@@ -4435,13 +4444,13 @@
               </w:rPr>
               <w:t>2026-07</w:t>
             </w:r>
-            <w:hyperlink r:id="rId64">
+            <w:hyperlink r:id="rId63">
               <w:r>
                 <w:rPr>
                   <w:color w:val="B31822"/>
                   <w:vertAlign w:val="superscript"/>
                 </w:rPr>
-                <w:t xml:space="preserve">53</w:t>
+                <w:t xml:space="preserve">52</w:t>
               </w:r>
             </w:hyperlink>
           </w:p>
@@ -4505,13 +4514,13 @@
               </w:rPr>
               <w:t>2025-12</w:t>
             </w:r>
-            <w:hyperlink r:id="rId65">
+            <w:hyperlink r:id="rId64">
               <w:r>
                 <w:rPr>
                   <w:color w:val="B31822"/>
                   <w:vertAlign w:val="superscript"/>
                 </w:rPr>
-                <w:t xml:space="preserve">54</w:t>
+                <w:t xml:space="preserve">53</w:t>
               </w:r>
             </w:hyperlink>
           </w:p>
@@ -4575,13 +4584,13 @@
               </w:rPr>
               <w:t>2026-09</w:t>
             </w:r>
-            <w:hyperlink r:id="rId66">
+            <w:hyperlink r:id="rId65">
               <w:r>
                 <w:rPr>
                   <w:color w:val="B31822"/>
                   <w:vertAlign w:val="superscript"/>
                 </w:rPr>
-                <w:t xml:space="preserve">55</w:t>
+                <w:t xml:space="preserve">54</w:t>
               </w:r>
             </w:hyperlink>
           </w:p>
@@ -4667,13 +4676,13 @@
               </w:rPr>
               <w:t>2024-11</w:t>
             </w:r>
-            <w:hyperlink r:id="rId67">
+            <w:hyperlink r:id="rId66">
               <w:r>
                 <w:rPr>
                   <w:color w:val="B31822"/>
                   <w:vertAlign w:val="superscript"/>
                 </w:rPr>
-                <w:t xml:space="preserve">56</w:t>
+                <w:t xml:space="preserve">55</w:t>
               </w:r>
             </w:hyperlink>
           </w:p>
@@ -4737,13 +4746,13 @@
               </w:rPr>
               <w:t>2025-02</w:t>
             </w:r>
-            <w:hyperlink r:id="rId68">
+            <w:hyperlink r:id="rId67">
               <w:r>
                 <w:rPr>
                   <w:color w:val="B31822"/>
                   <w:vertAlign w:val="superscript"/>
                 </w:rPr>
-                <w:t xml:space="preserve">57</w:t>
+                <w:t xml:space="preserve">56</w:t>
               </w:r>
             </w:hyperlink>
           </w:p>
@@ -4807,13 +4816,13 @@
               </w:rPr>
               <w:t>2026-04</w:t>
             </w:r>
-            <w:hyperlink r:id="rId69">
+            <w:hyperlink r:id="rId68">
               <w:r>
                 <w:rPr>
                   <w:color w:val="B31822"/>
                   <w:vertAlign w:val="superscript"/>
                 </w:rPr>
-                <w:t xml:space="preserve">58</w:t>
+                <w:t xml:space="preserve">57</w:t>
               </w:r>
             </w:hyperlink>
           </w:p>
@@ -4877,13 +4886,13 @@
               </w:rPr>
               <w:t>2025-07</w:t>
             </w:r>
-            <w:hyperlink r:id="rId70">
+            <w:hyperlink r:id="rId69">
               <w:r>
                 <w:rPr>
                   <w:color w:val="B31822"/>
                   <w:vertAlign w:val="superscript"/>
                 </w:rPr>
-                <w:t xml:space="preserve">59</w:t>
+                <w:t xml:space="preserve">58</w:t>
               </w:r>
             </w:hyperlink>
           </w:p>
@@ -4947,13 +4956,13 @@
               </w:rPr>
               <w:t>2026-09</w:t>
             </w:r>
-            <w:hyperlink r:id="rId71">
+            <w:hyperlink r:id="rId70">
               <w:r>
                 <w:rPr>
                   <w:color w:val="B31822"/>
                   <w:vertAlign w:val="superscript"/>
                 </w:rPr>
-                <w:t xml:space="preserve">60</w:t>
+                <w:t xml:space="preserve">59</w:t>
               </w:r>
             </w:hyperlink>
           </w:p>
@@ -5017,13 +5026,13 @@
               </w:rPr>
               <w:t>2025-12</w:t>
             </w:r>
-            <w:hyperlink r:id="rId72">
+            <w:hyperlink r:id="rId71">
               <w:r>
                 <w:rPr>
                   <w:color w:val="B31822"/>
                   <w:vertAlign w:val="superscript"/>
                 </w:rPr>
-                <w:t xml:space="preserve">61</w:t>
+                <w:t xml:space="preserve">60</w:t>
               </w:r>
             </w:hyperlink>
           </w:p>
@@ -5087,13 +5096,13 @@
               </w:rPr>
               <w:t>2025-04</w:t>
             </w:r>
-            <w:hyperlink r:id="rId73">
+            <w:hyperlink r:id="rId72">
               <w:r>
                 <w:rPr>
                   <w:color w:val="B31822"/>
                   <w:vertAlign w:val="superscript"/>
                 </w:rPr>
-                <w:t xml:space="preserve">62</w:t>
+                <w:t xml:space="preserve">61</w:t>
               </w:r>
             </w:hyperlink>
           </w:p>
@@ -5157,13 +5166,13 @@
               </w:rPr>
               <w:t>2025-06</w:t>
             </w:r>
-            <w:hyperlink r:id="rId74">
+            <w:hyperlink r:id="rId73">
               <w:r>
                 <w:rPr>
                   <w:color w:val="B31822"/>
                   <w:vertAlign w:val="superscript"/>
                 </w:rPr>
-                <w:t xml:space="preserve">63</w:t>
+                <w:t xml:space="preserve">62</w:t>
               </w:r>
             </w:hyperlink>
           </w:p>
@@ -5227,13 +5236,13 @@
               </w:rPr>
               <w:t>2025-11</w:t>
             </w:r>
-            <w:hyperlink r:id="rId75">
+            <w:hyperlink r:id="rId74">
               <w:r>
                 <w:rPr>
                   <w:color w:val="B31822"/>
                   <w:vertAlign w:val="superscript"/>
                 </w:rPr>
-                <w:t xml:space="preserve">64</w:t>
+                <w:t xml:space="preserve">63</w:t>
               </w:r>
             </w:hyperlink>
           </w:p>
@@ -5297,13 +5306,13 @@
               </w:rPr>
               <w:t>2025-02</w:t>
             </w:r>
-            <w:hyperlink r:id="rId68">
+            <w:hyperlink r:id="rId67">
               <w:r>
                 <w:rPr>
                   <w:color w:val="B31822"/>
                   <w:vertAlign w:val="superscript"/>
                 </w:rPr>
-                <w:t xml:space="preserve">57</w:t>
+                <w:t xml:space="preserve">56</w:t>
               </w:r>
             </w:hyperlink>
           </w:p>
@@ -5367,13 +5376,13 @@
               </w:rPr>
               <w:t>2026-07</w:t>
             </w:r>
-            <w:hyperlink r:id="rId76">
+            <w:hyperlink r:id="rId75">
               <w:r>
                 <w:rPr>
                   <w:color w:val="B31822"/>
                   <w:vertAlign w:val="superscript"/>
                 </w:rPr>
-                <w:t xml:space="preserve">65</w:t>
+                <w:t xml:space="preserve">64</w:t>
               </w:r>
             </w:hyperlink>
           </w:p>
@@ -5437,13 +5446,13 @@
               </w:rPr>
               <w:t>2025-04</w:t>
             </w:r>
-            <w:hyperlink r:id="rId77">
+            <w:hyperlink r:id="rId76">
               <w:r>
                 <w:rPr>
                   <w:color w:val="B31822"/>
                   <w:vertAlign w:val="superscript"/>
                 </w:rPr>
-                <w:t xml:space="preserve">66</w:t>
+                <w:t xml:space="preserve">65</w:t>
               </w:r>
             </w:hyperlink>
           </w:p>
@@ -5468,7 +5477,19 @@
         <w:widowControl/>
       </w:pPr>
       <w:r>
-        <w:t>A 2014 trade report said Australia has a smaller inbound than outbound medical tourism industry.</w:t>
+        <w:t>A 2014 trade-press article, citing Tourism Research Australia data, said Australia may have a smaller inbound than outbound medical tourism industry.</w:t>
+      </w:r>
+      <w:hyperlink r:id="rId77">
+        <w:r>
+          <w:rPr>
+            <w:color w:val="B31822"/>
+            <w:vertAlign w:val="superscript"/>
+          </w:rPr>
+          <w:t xml:space="preserve">66</w:t>
+        </w:r>
+      </w:hyperlink>
+      <w:r>
+        <w:t xml:space="preserve"> A 2017 review described a few wealthy Asia-Pacific patients, Epworth HealthCare reported 600 international patients a year from 31 countries, and some Sydney hospitals hold contracts with Pacific islands.</w:t>
       </w:r>
       <w:hyperlink r:id="rId78">
         <w:r>
@@ -5480,7 +5501,7 @@
         </w:r>
       </w:hyperlink>
       <w:r>
-        <w:t xml:space="preserve"> A 2017 review described a few wealthy Asia-Pacific patients, Epworth HealthCare reported 600 international patients a year from 31 countries, and some Sydney hospitals hold contracts with Pacific islands.</w:t>
+        <w:t xml:space="preserve"> Icon Cancer Centre says international patients need a visa and a referral to be treated in Australia, and it directs Asia-Pacific patients to its concierge service in Singapore, Indonesia and Malaysia.</w:t>
       </w:r>
       <w:hyperlink r:id="rId79">
         <w:r>
@@ -5492,7 +5513,7 @@
         </w:r>
       </w:hyperlink>
       <w:r>
-        <w:t xml:space="preserve"> Icon Cancer Centre says international patients need a visa and a referral to be treated in Australia, and it directs Asia-Pacific patients to its concierge service in Singapore, Indonesia and Malaysia.</w:t>
+        <w:t xml:space="preserve"> A 2011 article described residents of Papua New Guinea treaty villages crossing into the Torres Strait to use Queensland Health clinics, and a 2022 study says Queensland Health still triages Papua New Guinea nationals who present there.</w:t>
       </w:r>
       <w:hyperlink r:id="rId80">
         <w:r>
@@ -5500,21 +5521,21 @@
             <w:color w:val="B31822"/>
             <w:vertAlign w:val="superscript"/>
           </w:rPr>
-          <w:t xml:space="preserve">69</w:t>
+          <w:t xml:space="preserve">69,</w:t>
         </w:r>
       </w:hyperlink>
-      <w:r>
-        <w:t xml:space="preserve"> A 2011 article described residents of Papua New Guinea treaty villages crossing into the Torres Strait to use Queensland Health clinics, and a 2022 study says Queensland Health still triages Papua New Guinea nationals who present there.</w:t>
-      </w:r>
       <w:hyperlink r:id="rId81">
         <w:r>
           <w:rPr>
             <w:color w:val="B31822"/>
             <w:vertAlign w:val="superscript"/>
           </w:rPr>
-          <w:t xml:space="preserve">70,</w:t>
+          <w:t xml:space="preserve">70</w:t>
         </w:r>
       </w:hyperlink>
+      <w:r>
+        <w:t xml:space="preserve"> Outbound, plastic surgeons said in January 2024 that cosmetic tourism had surged in recent years, with online offers to destinations such as Turkey, Thailand and Brazil.</w:t>
+      </w:r>
       <w:hyperlink r:id="rId82">
         <w:r>
           <w:rPr>
@@ -5522,18 +5543,6 @@
             <w:vertAlign w:val="superscript"/>
           </w:rPr>
           <w:t xml:space="preserve">71</w:t>
-        </w:r>
-      </w:hyperlink>
-      <w:r>
-        <w:t xml:space="preserve"> Outbound, plastic surgeons said in January 2024 that cosmetic tourism had surged in recent years, with online offers to destinations such as Turkey, Thailand and Brazil.</w:t>
-      </w:r>
-      <w:hyperlink r:id="rId83">
-        <w:r>
-          <w:rPr>
-            <w:color w:val="B31822"/>
-            <w:vertAlign w:val="superscript"/>
-          </w:rPr>
-          <w:t xml:space="preserve">72</w:t>
         </w:r>
       </w:hyperlink>
     </w:p>
@@ -5587,25 +5596,25 @@
       <w:r>
         <w:t>Receivers announced that 25 Healthscope hospitals and its central services platform will be divided among four operators: Calvary Health Care takes 14, and Healthe Care, ACURIO Health and KnG Group take the rest.</w:t>
       </w:r>
-      <w:hyperlink r:id="rId39">
+      <w:hyperlink r:id="rId38">
         <w:r>
           <w:rPr>
             <w:color w:val="B31822"/>
             <w:vertAlign w:val="superscript"/>
           </w:rPr>
-          <w:t xml:space="preserve">29</w:t>
+          <w:t xml:space="preserve">28</w:t>
         </w:r>
       </w:hyperlink>
       <w:r>
         <w:t xml:space="preserve"> Healthscope entered receivership in May 2025 after its North American private equity owner, Brookfield, withdrew support.</w:t>
       </w:r>
-      <w:hyperlink r:id="rId39">
+      <w:hyperlink r:id="rId38">
         <w:r>
           <w:rPr>
             <w:color w:val="B31822"/>
             <w:vertAlign w:val="superscript"/>
           </w:rPr>
-          <w:t xml:space="preserve">29</w:t>
+          <w:t xml:space="preserve">28</w:t>
         </w:r>
       </w:hyperlink>
     </w:p>
@@ -5637,25 +5646,25 @@
       <w:r>
         <w:t>The Budget provides A$220.3 billion over five years to the states for public hospital services and the new funding addendum, and A$1.8 billion over five years for Medicare Urgent Care Clinics on an ongoing basis.</w:t>
       </w:r>
-      <w:hyperlink r:id="rId35">
+      <w:hyperlink r:id="rId34">
         <w:r>
           <w:rPr>
             <w:color w:val="B31822"/>
             <w:vertAlign w:val="superscript"/>
           </w:rPr>
-          <w:t xml:space="preserve">25</w:t>
+          <w:t xml:space="preserve">24</w:t>
         </w:r>
       </w:hyperlink>
       <w:r>
         <w:t xml:space="preserve"> It removes the age-based uplift of the private health insurance rebate from 1 April 2027.</w:t>
       </w:r>
-      <w:hyperlink r:id="rId35">
+      <w:hyperlink r:id="rId34">
         <w:r>
           <w:rPr>
             <w:color w:val="B31822"/>
             <w:vertAlign w:val="superscript"/>
           </w:rPr>
-          <w:t xml:space="preserve">25</w:t>
+          <w:t xml:space="preserve">24</w:t>
         </w:r>
       </w:hyperlink>
     </w:p>
@@ -5737,34 +5746,34 @@
       <w:r>
         <w:t>Legislation setting out the functions and independence of the Australian Centre for Disease Control passed the Senate, with a director-general appointed by the health minister and operations due to start on 1 January 2026.</w:t>
       </w:r>
-      <w:hyperlink r:id="rId55">
+      <w:hyperlink r:id="rId54">
         <w:r>
           <w:rPr>
             <w:color w:val="B31822"/>
             <w:vertAlign w:val="superscript"/>
           </w:rPr>
-          <w:t xml:space="preserve">45</w:t>
+          <w:t xml:space="preserve">44</w:t>
         </w:r>
       </w:hyperlink>
       <w:r>
         <w:t xml:space="preserve"> An interim centre had operated inside the health department since January 2024, and the government committed A$251 million over four years.</w:t>
       </w:r>
-      <w:hyperlink r:id="rId55">
+      <w:hyperlink r:id="rId54">
         <w:r>
           <w:rPr>
             <w:color w:val="B31822"/>
             <w:vertAlign w:val="superscript"/>
           </w:rPr>
-          <w:t xml:space="preserve">45,</w:t>
+          <w:t xml:space="preserve">44,</w:t>
         </w:r>
       </w:hyperlink>
-      <w:hyperlink r:id="rId57">
+      <w:hyperlink r:id="rId56">
         <w:r>
           <w:rPr>
             <w:color w:val="B31822"/>
             <w:vertAlign w:val="superscript"/>
           </w:rPr>
-          <w:t xml:space="preserve">47</w:t>
+          <w:t xml:space="preserve">46</w:t>
         </w:r>
       </w:hyperlink>
     </w:p>
@@ -5796,27 +5805,15 @@
       <w:r>
         <w:t>From 1 November 2025, Medicare bulk billing incentives were extended beyond children under 16 and concession card holders to all Australians, and practices that bulk bill every eligible patient can share an extra 12.5 percent incentive payment with their GPs.</w:t>
       </w:r>
-      <w:hyperlink r:id="rId36">
+      <w:hyperlink r:id="rId35">
         <w:r>
           <w:rPr>
             <w:color w:val="B31822"/>
             <w:vertAlign w:val="superscript"/>
           </w:rPr>
-          <w:t xml:space="preserve">26,</w:t>
+          <w:t xml:space="preserve">25,</w:t>
         </w:r>
       </w:hyperlink>
-      <w:hyperlink r:id="rId37">
-        <w:r>
-          <w:rPr>
-            <w:color w:val="B31822"/>
-            <w:vertAlign w:val="superscript"/>
-          </w:rPr>
-          <w:t xml:space="preserve">27</w:t>
-        </w:r>
-      </w:hyperlink>
-      <w:r>
-        <w:t xml:space="preserve"> The government projects that 9 in 10 GP visits will be bulk billed by 2030.</w:t>
-      </w:r>
       <w:hyperlink r:id="rId36">
         <w:r>
           <w:rPr>
@@ -5824,6 +5821,18 @@
             <w:vertAlign w:val="superscript"/>
           </w:rPr>
           <w:t xml:space="preserve">26</w:t>
+        </w:r>
+      </w:hyperlink>
+      <w:r>
+        <w:t xml:space="preserve"> The government projects that 9 in 10 GP visits will be bulk billed by 2030.</w:t>
+      </w:r>
+      <w:hyperlink r:id="rId35">
+        <w:r>
+          <w:rPr>
+            <w:color w:val="B31822"/>
+            <w:vertAlign w:val="superscript"/>
+          </w:rPr>
+          <w:t xml:space="preserve">25</w:t>
         </w:r>
       </w:hyperlink>
     </w:p>

</xml_diff>